<commit_message>
Atualiza roteiro, pacotes e manuais em Word com o caminho vivo do Início e a agenda ICS.
Co-authored-by: Cursor <cursoragent@cursor.com>
</commit_message>
<xml_diff>
--- a/pacotes-funcionalidades.docx
+++ b/pacotes-funcionalidades.docx
@@ -43,7 +43,7 @@
           <w:sz w:val="22"/>
           <w:szCs w:val="22"/>
         </w:rPr>
-        <w:t xml:space="preserve"> 1º de setembro de 2026</w:t>
+        <w:t xml:space="preserve"> 2 de setembro de 2026</w:t>
       </w:r>
     </w:p>
     <w:p>
@@ -1294,7 +1294,7 @@
           <w:sz w:val="22"/>
           <w:szCs w:val="22"/>
         </w:rPr>
-        <w:t xml:space="preserve"> no evento: inscrição da família no culto.</w:t>
+        <w:t xml:space="preserve"> no evento (Início → toque no culto): inscrição da família.</w:t>
       </w:r>
     </w:p>
     <w:p>
@@ -1314,6 +1314,64 @@
           <w:szCs w:val="22"/>
         </w:rPr>
         <w:t xml:space="preserve">Check-in da família no fluxo da agenda (presença no evento do dia).</w:t>
+      </w:r>
+    </w:p>
+    <w:p>
+      <w:pPr>
+        <w:pStyle w:val="ListParagraph"/>
+        <w:numPr>
+          <w:ilvl w:val="0"/>
+          <w:numId w:val="2"/>
+        </w:numPr>
+        <w:spacing w:after="60" w:line="276" w:lineRule="auto"/>
+      </w:pPr>
+      <w:r>
+        <w:rPr>
+          <w:rFonts w:ascii="Calibri" w:cs="Calibri" w:eastAsia="Calibri" w:hAnsi="Calibri"/>
+          <w:color w:val="1E293B"/>
+          <w:sz w:val="22"/>
+          <w:szCs w:val="22"/>
+        </w:rPr>
+        <w:t xml:space="preserve">Ao confirmar a audiência, </w:t>
+      </w:r>
+      <w:r>
+        <w:rPr>
+          <w:rFonts w:ascii="Calibri" w:cs="Calibri" w:eastAsia="Calibri" w:hAnsi="Calibri"/>
+          <w:b/>
+          <w:bCs/>
+          <w:color w:val="1E293B"/>
+          <w:sz w:val="22"/>
+          <w:szCs w:val="22"/>
+        </w:rPr>
+        <w:t xml:space="preserve">adicionar o culto à agenda do celular</w:t>
+      </w:r>
+      <w:r>
+        <w:rPr>
+          <w:rFonts w:ascii="Calibri" w:cs="Calibri" w:eastAsia="Calibri" w:hAnsi="Calibri"/>
+          <w:color w:val="1E293B"/>
+          <w:sz w:val="22"/>
+          <w:szCs w:val="22"/>
+        </w:rPr>
+        <w:t xml:space="preserve"> (Google Agenda + arquivo </w:t>
+      </w:r>
+      <w:r>
+        <w:rPr>
+          <w:rFonts w:ascii="Calibri" w:cs="Calibri" w:eastAsia="Calibri" w:hAnsi="Calibri"/>
+          <w:color w:val="1E293B"/>
+          <w:sz w:val="22"/>
+          <w:szCs w:val="22"/>
+          <w:shd w:fill="F1F5F9" w:val="clear"/>
+        </w:rPr>
+        <w:t xml:space="preserve">.ics</w:t>
+      </w:r>
+      <w:r>
+        <w:rPr>
+          <w:rFonts w:ascii="Calibri" w:cs="Calibri" w:eastAsia="Calibri" w:hAnsi="Calibri"/>
+          <w:color w:val="1E293B"/>
+          <w:sz w:val="22"/>
+          <w:szCs w:val="22"/>
+        </w:rPr>
+        <w:t xml:space="preserve"> para Apple Calendar e Outlook; horário da igreja, sem atrasar o compromisso).</w:t>
       </w:r>
     </w:p>
     <w:p>
@@ -4821,7 +4879,7 @@
                 <w:sz w:val="18"/>
                 <w:szCs w:val="18"/>
               </w:rPr>
-              <w:t xml:space="preserve">Início (avisos/eventos) e agenda da família</w:t>
+              <w:t xml:space="preserve">Início (avisos/eventos), agenda da família e compromisso no calendário do celular</w:t>
             </w:r>
           </w:p>
         </w:tc>

</xml_diff>